<commit_message>
update documents final version？
</commit_message>
<xml_diff>
--- a/项目文档/详细设计/02-详细设计-界面设计.docx
+++ b/项目文档/详细设计/02-详细设计-界面设计.docx
@@ -7,6 +7,8 @@
       <w:pPr>
         <w:pStyle w:val="32"/>
       </w:pPr>
+      <w:bookmarkStart w:id="0" w:name="_GoBack"/>
+      <w:bookmarkEnd w:id="0"/>
       <w:r>
         <w:t>第四部分 界面和业务界面设计</w:t>
       </w:r>
@@ -192,52 +194,7 @@
           <w:rFonts w:ascii="宋体" w:hAnsi="宋体" w:eastAsia="宋体"/>
           <w:sz w:val="24"/>
         </w:rPr>
-        <w:t>主界面为常驻桌面右下角的悬浮面板。最上方为标题栏，含 Logo、</w:t>
-      </w:r>
-      <w:r>
-        <w:rPr>
-          <w:rFonts w:hint="eastAsia" w:ascii="宋体" w:hAnsi="宋体"/>
-          <w:sz w:val="24"/>
-          <w:lang w:val="en-US" w:eastAsia="zh-CN"/>
-        </w:rPr>
-        <w:t>准备指示框</w:t>
-      </w:r>
-      <w:r>
-        <w:rPr>
-          <w:rFonts w:ascii="宋体" w:hAnsi="宋体" w:eastAsia="宋体"/>
-          <w:sz w:val="24"/>
-        </w:rPr>
-        <w:t>与</w:t>
-      </w:r>
-      <w:r>
-        <w:rPr>
-          <w:rFonts w:hint="eastAsia" w:ascii="宋体" w:hAnsi="宋体"/>
-          <w:sz w:val="24"/>
-          <w:lang w:val="en-US" w:eastAsia="zh-CN"/>
-        </w:rPr>
-        <w:t>侧栏</w:t>
-      </w:r>
-      <w:r>
-        <w:rPr>
-          <w:rFonts w:ascii="宋体" w:hAnsi="宋体" w:eastAsia="宋体"/>
-          <w:sz w:val="24"/>
-        </w:rPr>
-        <w:t>按钮；中部自上而下依次为对话与步骤区、指令输入栏；</w:t>
-      </w:r>
-      <w:r>
-        <w:rPr>
-          <w:rFonts w:hint="eastAsia" w:ascii="宋体" w:hAnsi="宋体"/>
-          <w:sz w:val="24"/>
-          <w:lang w:val="en-US" w:eastAsia="zh-CN"/>
-        </w:rPr>
-        <w:t>准备指示框与步骤</w:t>
-      </w:r>
-      <w:r>
-        <w:rPr>
-          <w:rFonts w:ascii="宋体" w:hAnsi="宋体" w:eastAsia="宋体"/>
-          <w:sz w:val="24"/>
-        </w:rPr>
-        <w:t>以图标与颜色区分“待执行、执行中、已完成、失败、被拦截、跳过”六种状态，并在每步旁标注操作类型。</w:t>
+        <w:t>主界面为常驻桌面右下角的悬浮面板。最上方为标题栏，含 Logo、风格切换与折叠/关闭按钮；中部自上而下依次为对话与步骤区、指令输入栏；步骤卡片以图标与颜色区分“待执行、执行中、已完成、失败、被拦截、跳过”六种状态，并在每步旁标注操作类型与风险评分圆点。</w:t>
       </w:r>
     </w:p>
     <w:p>
@@ -248,7 +205,7 @@
         <w:drawing>
           <wp:inline distT="0" distB="0" distL="114300" distR="114300">
             <wp:extent cx="2286000" cy="4175125"/>
-            <wp:effectExtent l="0" t="0" r="0" b="3175"/>
+            <wp:effectExtent l="0" t="0" r="0" b="15875"/>
             <wp:docPr id="1" name="Picture 1"/>
             <wp:cNvGraphicFramePr>
               <a:graphicFrameLocks xmlns:a="http://schemas.openxmlformats.org/drawingml/2006/main" noChangeAspect="1"/>
@@ -329,7 +286,7 @@
         <w:drawing>
           <wp:inline distT="0" distB="0" distL="114300" distR="114300">
             <wp:extent cx="4206240" cy="642620"/>
-            <wp:effectExtent l="0" t="0" r="10160" b="5080"/>
+            <wp:effectExtent l="0" t="0" r="3810" b="5080"/>
             <wp:docPr id="2" name="Picture 2"/>
             <wp:cNvGraphicFramePr>
               <a:graphicFrameLocks xmlns:a="http://schemas.openxmlformats.org/drawingml/2006/main" noChangeAspect="1"/>
@@ -399,22 +356,7 @@
           <w:rFonts w:ascii="宋体" w:hAnsi="宋体" w:eastAsia="宋体"/>
           <w:sz w:val="24"/>
         </w:rPr>
-        <w:t>系统内置多套界面主题，覆盖不同审美与场景需求：默认蓝为通用现代风格；典雅黑为深色护眼风格；牛皮纸为复古纸感风格；黑金轻奢为高对比商务风格；耄耋主题面向老年用户，采用大字号、高对比与简化布局以提升可读性。</w:t>
-      </w:r>
-      <w:r>
-        <w:rPr>
-          <w:rFonts w:hint="eastAsia" w:ascii="宋体" w:hAnsi="宋体"/>
-          <w:sz w:val="24"/>
-          <w:lang w:val="en-US" w:eastAsia="zh-CN"/>
-        </w:rPr>
-        <w:t>同时各界面提供大量自定义选项，包括字号，透明度，默认大小，对话头像，开屏动画，主题特色选项等，供不同需求喜好的用户使用。</w:t>
-      </w:r>
-      <w:r>
-        <w:rPr>
-          <w:rFonts w:ascii="宋体" w:hAnsi="宋体" w:eastAsia="宋体"/>
-          <w:sz w:val="24"/>
-        </w:rPr>
-        <w:t>各主题的主界面与紧凑条如下所示。</w:t>
+        <w:t>系统内置多套界面主题，覆盖不同审美与场景需求：默认蓝为通用现代风格；典雅黑为深色护眼风格；牛皮纸为复古纸感风格；黑金轻奢为高对比商务风格；耄耋主题面向老年用户，采用大字号、高对比与简化布局以提升可读性。各主题的主界面与紧凑条如下所示。</w:t>
       </w:r>
     </w:p>
     <w:p>
@@ -425,7 +367,7 @@
         <w:drawing>
           <wp:inline distT="0" distB="0" distL="114300" distR="114300">
             <wp:extent cx="2286000" cy="4239895"/>
-            <wp:effectExtent l="0" t="0" r="0" b="1905"/>
+            <wp:effectExtent l="0" t="0" r="0" b="8255"/>
             <wp:docPr id="3" name="Picture 3"/>
             <wp:cNvGraphicFramePr>
               <a:graphicFrameLocks xmlns:a="http://schemas.openxmlformats.org/drawingml/2006/main" noChangeAspect="1"/>
@@ -543,7 +485,7 @@
         <w:drawing>
           <wp:inline distT="0" distB="0" distL="114300" distR="114300">
             <wp:extent cx="2286000" cy="4171950"/>
-            <wp:effectExtent l="0" t="0" r="0" b="6350"/>
+            <wp:effectExtent l="0" t="0" r="0" b="0"/>
             <wp:docPr id="5" name="Picture 5"/>
             <wp:cNvGraphicFramePr>
               <a:graphicFrameLocks xmlns:a="http://schemas.openxmlformats.org/drawingml/2006/main" noChangeAspect="1"/>
@@ -720,7 +662,7 @@
         <w:drawing>
           <wp:inline distT="0" distB="0" distL="114300" distR="114300">
             <wp:extent cx="4023360" cy="688340"/>
-            <wp:effectExtent l="0" t="0" r="2540" b="10160"/>
+            <wp:effectExtent l="0" t="0" r="15240" b="16510"/>
             <wp:docPr id="8" name="Picture 8"/>
             <wp:cNvGraphicFramePr>
               <a:graphicFrameLocks xmlns:a="http://schemas.openxmlformats.org/drawingml/2006/main" noChangeAspect="1"/>
@@ -779,7 +721,7 @@
         <w:drawing>
           <wp:inline distT="0" distB="0" distL="114300" distR="114300">
             <wp:extent cx="4023360" cy="635635"/>
-            <wp:effectExtent l="0" t="0" r="2540" b="12065"/>
+            <wp:effectExtent l="0" t="0" r="15240" b="12065"/>
             <wp:docPr id="9" name="Picture 9"/>
             <wp:cNvGraphicFramePr>
               <a:graphicFrameLocks xmlns:a="http://schemas.openxmlformats.org/drawingml/2006/main" noChangeAspect="1"/>
@@ -838,7 +780,7 @@
         <w:drawing>
           <wp:inline distT="0" distB="0" distL="114300" distR="114300">
             <wp:extent cx="4023360" cy="648970"/>
-            <wp:effectExtent l="0" t="0" r="2540" b="11430"/>
+            <wp:effectExtent l="0" t="0" r="15240" b="17780"/>
             <wp:docPr id="10" name="Picture 10"/>
             <wp:cNvGraphicFramePr>
               <a:graphicFrameLocks xmlns:a="http://schemas.openxmlformats.org/drawingml/2006/main" noChangeAspect="1"/>
@@ -897,7 +839,7 @@
         <w:drawing>
           <wp:inline distT="0" distB="0" distL="114300" distR="114300">
             <wp:extent cx="4023360" cy="674370"/>
-            <wp:effectExtent l="0" t="0" r="2540" b="11430"/>
+            <wp:effectExtent l="0" t="0" r="15240" b="11430"/>
             <wp:docPr id="11" name="Picture 11"/>
             <wp:cNvGraphicFramePr>
               <a:graphicFrameLocks xmlns:a="http://schemas.openxmlformats.org/drawingml/2006/main" noChangeAspect="1"/>
@@ -961,40 +903,13 @@
         <w:pStyle w:val="11"/>
         <w:spacing w:after="80"/>
         <w:ind w:firstLine="480"/>
-        <w:rPr>
-          <w:rFonts w:hint="default" w:eastAsia="宋体"/>
-          <w:lang w:val="en-US" w:eastAsia="zh-CN"/>
-        </w:rPr>
       </w:pPr>
       <w:r>
         <w:rPr>
           <w:rFonts w:ascii="宋体" w:hAnsi="宋体" w:eastAsia="宋体"/>
           <w:sz w:val="24"/>
         </w:rPr>
-        <w:t>在执行涉及关键操作的步骤前，系统会弹出检测确认提示，向用户展示即将执行的动作与目标位置，经用户确认后方才继续，避免误操作。</w:t>
-      </w:r>
-      <w:r>
-        <w:rPr>
-          <w:rFonts w:hint="eastAsia" w:ascii="宋体" w:hAnsi="宋体"/>
-          <w:sz w:val="24"/>
-          <w:lang w:val="en-US" w:eastAsia="zh-CN"/>
-        </w:rPr>
-        <w:t>在L4模式下，</w:t>
-      </w:r>
-      <w:r>
-        <w:rPr>
-          <w:rFonts w:ascii="宋体" w:hAnsi="宋体" w:eastAsia="宋体"/>
-          <w:sz w:val="24"/>
-        </w:rPr>
-        <w:t>对于复杂任务，系统在全屏透明覆盖层上以箭头、高亮框与编号标签，将每一步的操作位置直接叠加绘制在真实界面之上。</w:t>
-      </w:r>
-      <w:r>
-        <w:rPr>
-          <w:rFonts w:hint="eastAsia" w:ascii="宋体" w:hAnsi="宋体"/>
-          <w:sz w:val="24"/>
-          <w:lang w:val="en-US" w:eastAsia="zh-CN"/>
-        </w:rPr>
-        <w:t>而在L5模式下，则用用户逐步确认来约束AI操作边界。</w:t>
+        <w:t>在执行涉及关键操作的步骤前，系统会弹出检测确认提示，向用户展示即将执行的动作与目标位置，经用户确认后方才继续，避免误操作。对于复杂任务，系统在全屏透明覆盖层上以箭头、高亮框与编号标签，将每一步的操作位置直接叠加绘制在真实界面之上。</w:t>
       </w:r>
     </w:p>
     <w:p>
@@ -1005,7 +920,7 @@
         <w:drawing>
           <wp:inline distT="0" distB="0" distL="114300" distR="114300">
             <wp:extent cx="2377440" cy="1570355"/>
-            <wp:effectExtent l="0" t="0" r="10160" b="4445"/>
+            <wp:effectExtent l="0" t="0" r="3810" b="10795"/>
             <wp:docPr id="12" name="Picture 12"/>
             <wp:cNvGraphicFramePr>
               <a:graphicFrameLocks xmlns:a="http://schemas.openxmlformats.org/drawingml/2006/main" noChangeAspect="1"/>
@@ -1060,6 +975,60 @@
       <w:pPr>
         <w:jc w:val="center"/>
       </w:pPr>
+      <w:r>
+        <w:drawing>
+          <wp:inline distT="0" distB="0" distL="114300" distR="114300">
+            <wp:extent cx="5394960" cy="3331845"/>
+            <wp:effectExtent l="0" t="0" r="15240" b="1905"/>
+            <wp:docPr id="13" name="Picture 13"/>
+            <wp:cNvGraphicFramePr>
+              <a:graphicFrameLocks xmlns:a="http://schemas.openxmlformats.org/drawingml/2006/main" noChangeAspect="1"/>
+            </wp:cNvGraphicFramePr>
+            <a:graphic xmlns:a="http://schemas.openxmlformats.org/drawingml/2006/main">
+              <a:graphicData uri="http://schemas.openxmlformats.org/drawingml/2006/picture">
+                <pic:pic xmlns:pic="http://schemas.openxmlformats.org/drawingml/2006/picture">
+                  <pic:nvPicPr>
+                    <pic:cNvPr id="13" name="Picture 13"/>
+                    <pic:cNvPicPr>
+                      <a:picLocks noChangeAspect="1"/>
+                    </pic:cNvPicPr>
+                  </pic:nvPicPr>
+                  <pic:blipFill>
+                    <a:blip r:embed="rId18"/>
+                    <a:stretch>
+                      <a:fillRect/>
+                    </a:stretch>
+                  </pic:blipFill>
+                  <pic:spPr>
+                    <a:xfrm>
+                      <a:off x="0" y="0"/>
+                      <a:ext cx="5394960" cy="3332350"/>
+                    </a:xfrm>
+                    <a:prstGeom prst="rect">
+                      <a:avLst/>
+                    </a:prstGeom>
+                  </pic:spPr>
+                </pic:pic>
+              </a:graphicData>
+            </a:graphic>
+          </wp:inline>
+        </w:drawing>
+      </w:r>
+    </w:p>
+    <w:p>
+      <w:pPr>
+        <w:spacing w:before="40" w:after="120"/>
+        <w:jc w:val="center"/>
+      </w:pPr>
+      <w:r>
+        <w:rPr>
+          <w:rFonts w:ascii="宋体" w:hAnsi="宋体" w:eastAsia="宋体"/>
+          <w:b/>
+          <w:color w:val="404040"/>
+          <w:sz w:val="21"/>
+        </w:rPr>
+        <w:t>图16  全屏标注覆盖层演示（箭头+高亮框+编号）</w:t>
+      </w:r>
     </w:p>
     <w:p>
       <w:pPr>
@@ -1091,7 +1060,7 @@
         <w:drawing>
           <wp:inline distT="0" distB="0" distL="114300" distR="114300">
             <wp:extent cx="4206240" cy="1687830"/>
-            <wp:effectExtent l="0" t="0" r="10160" b="1270"/>
+            <wp:effectExtent l="0" t="0" r="3810" b="7620"/>
             <wp:docPr id="14" name="Picture 14"/>
             <wp:cNvGraphicFramePr>
               <a:graphicFrameLocks xmlns:a="http://schemas.openxmlformats.org/drawingml/2006/main" noChangeAspect="1"/>
@@ -1106,7 +1075,7 @@
                     </pic:cNvPicPr>
                   </pic:nvPicPr>
                   <pic:blipFill>
-                    <a:blip r:embed="rId18"/>
+                    <a:blip r:embed="rId19"/>
                     <a:stretch>
                       <a:fillRect/>
                     </a:stretch>
@@ -1187,7 +1156,7 @@
                     </pic:cNvPicPr>
                   </pic:nvPicPr>
                   <pic:blipFill>
-                    <a:blip r:embed="rId19"/>
+                    <a:blip r:embed="rId20"/>
                     <a:stretch>
                       <a:fillRect/>
                     </a:stretch>
@@ -1231,7 +1200,7 @@
         <w:drawing>
           <wp:inline distT="0" distB="0" distL="114300" distR="114300">
             <wp:extent cx="4754880" cy="3391535"/>
-            <wp:effectExtent l="0" t="0" r="7620" b="12065"/>
+            <wp:effectExtent l="0" t="0" r="7620" b="18415"/>
             <wp:docPr id="16" name="Picture 16"/>
             <wp:cNvGraphicFramePr>
               <a:graphicFrameLocks xmlns:a="http://schemas.openxmlformats.org/drawingml/2006/main" noChangeAspect="1"/>
@@ -1246,7 +1215,7 @@
                     </pic:cNvPicPr>
                   </pic:nvPicPr>
                   <pic:blipFill>
-                    <a:blip r:embed="rId20"/>
+                    <a:blip r:embed="rId21"/>
                     <a:stretch>
                       <a:fillRect/>
                     </a:stretch>
@@ -1290,7 +1259,7 @@
         <w:drawing>
           <wp:inline distT="0" distB="0" distL="114300" distR="114300">
             <wp:extent cx="4389120" cy="3735070"/>
-            <wp:effectExtent l="0" t="0" r="5080" b="11430"/>
+            <wp:effectExtent l="0" t="0" r="11430" b="17780"/>
             <wp:docPr id="17" name="Picture 17"/>
             <wp:cNvGraphicFramePr>
               <a:graphicFrameLocks xmlns:a="http://schemas.openxmlformats.org/drawingml/2006/main" noChangeAspect="1"/>
@@ -1305,7 +1274,7 @@
                     </pic:cNvPicPr>
                   </pic:nvPicPr>
                   <pic:blipFill>
-                    <a:blip r:embed="rId21"/>
+                    <a:blip r:embed="rId22"/>
                     <a:stretch>
                       <a:fillRect/>
                     </a:stretch>
@@ -1349,7 +1318,7 @@
         <w:drawing>
           <wp:inline distT="0" distB="0" distL="114300" distR="114300">
             <wp:extent cx="4206240" cy="3998595"/>
-            <wp:effectExtent l="0" t="0" r="10160" b="1905"/>
+            <wp:effectExtent l="0" t="0" r="3810" b="1905"/>
             <wp:docPr id="18" name="Picture 18"/>
             <wp:cNvGraphicFramePr>
               <a:graphicFrameLocks xmlns:a="http://schemas.openxmlformats.org/drawingml/2006/main" noChangeAspect="1"/>
@@ -1364,7 +1333,7 @@
                     </pic:cNvPicPr>
                   </pic:nvPicPr>
                   <pic:blipFill>
-                    <a:blip r:embed="rId22"/>
+                    <a:blip r:embed="rId23"/>
                     <a:stretch>
                       <a:fillRect/>
                     </a:stretch>
@@ -1423,7 +1392,7 @@
                     </pic:cNvPicPr>
                   </pic:nvPicPr>
                   <pic:blipFill>
-                    <a:blip r:embed="rId23"/>
+                    <a:blip r:embed="rId24"/>
                     <a:stretch>
                       <a:fillRect/>
                     </a:stretch>
@@ -1467,7 +1436,7 @@
         <w:drawing>
           <wp:inline distT="0" distB="0" distL="114300" distR="114300">
             <wp:extent cx="4754880" cy="2078990"/>
-            <wp:effectExtent l="0" t="0" r="7620" b="3810"/>
+            <wp:effectExtent l="0" t="0" r="7620" b="16510"/>
             <wp:docPr id="20" name="Picture 20"/>
             <wp:cNvGraphicFramePr>
               <a:graphicFrameLocks xmlns:a="http://schemas.openxmlformats.org/drawingml/2006/main" noChangeAspect="1"/>
@@ -1482,7 +1451,7 @@
                     </pic:cNvPicPr>
                   </pic:nvPicPr>
                   <pic:blipFill>
-                    <a:blip r:embed="rId24"/>
+                    <a:blip r:embed="rId25"/>
                     <a:stretch>
                       <a:fillRect/>
                     </a:stretch>
@@ -1548,7 +1517,7 @@
         <w:drawing>
           <wp:inline distT="0" distB="0" distL="114300" distR="114300">
             <wp:extent cx="3291840" cy="822960"/>
-            <wp:effectExtent l="0" t="0" r="10160" b="2540"/>
+            <wp:effectExtent l="0" t="0" r="3810" b="15240"/>
             <wp:docPr id="21" name="Picture 21"/>
             <wp:cNvGraphicFramePr>
               <a:graphicFrameLocks xmlns:a="http://schemas.openxmlformats.org/drawingml/2006/main" noChangeAspect="1"/>
@@ -1563,7 +1532,7 @@
                     </pic:cNvPicPr>
                   </pic:nvPicPr>
                   <pic:blipFill>
-                    <a:blip r:embed="rId25"/>
+                    <a:blip r:embed="rId26"/>
                     <a:stretch>
                       <a:fillRect/>
                     </a:stretch>
@@ -1661,87 +1630,6 @@
                 <pic:pic xmlns:pic="http://schemas.openxmlformats.org/drawingml/2006/picture">
                   <pic:nvPicPr>
                     <pic:cNvPr id="22" name="Picture 22"/>
-                    <pic:cNvPicPr>
-                      <a:picLocks noChangeAspect="1"/>
-                    </pic:cNvPicPr>
-                  </pic:nvPicPr>
-                  <pic:blipFill>
-                    <a:blip r:embed="rId26"/>
-                    <a:stretch>
-                      <a:fillRect/>
-                    </a:stretch>
-                  </pic:blipFill>
-                  <pic:spPr>
-                    <a:xfrm>
-                      <a:off x="0" y="0"/>
-                      <a:ext cx="5486400" cy="3086100"/>
-                    </a:xfrm>
-                    <a:prstGeom prst="rect">
-                      <a:avLst/>
-                    </a:prstGeom>
-                  </pic:spPr>
-                </pic:pic>
-              </a:graphicData>
-            </a:graphic>
-          </wp:inline>
-        </w:drawing>
-      </w:r>
-    </w:p>
-    <w:p>
-      <w:pPr>
-        <w:spacing w:before="40" w:after="120"/>
-        <w:jc w:val="center"/>
-      </w:pPr>
-      <w:r>
-        <w:rPr>
-          <w:rFonts w:ascii="宋体" w:hAnsi="宋体" w:eastAsia="宋体"/>
-          <w:b/>
-          <w:color w:val="404040"/>
-          <w:sz w:val="21"/>
-        </w:rPr>
-        <w:t>图25  Web 端登录页面</w:t>
-      </w:r>
-    </w:p>
-    <w:p>
-      <w:pPr>
-        <w:pStyle w:val="6"/>
-      </w:pPr>
-      <w:r>
-        <w:t>b、总览页面</w:t>
-      </w:r>
-    </w:p>
-    <w:p>
-      <w:pPr>
-        <w:pStyle w:val="11"/>
-        <w:spacing w:after="80"/>
-        <w:ind w:firstLine="480"/>
-      </w:pPr>
-      <w:r>
-        <w:rPr>
-          <w:rFonts w:ascii="宋体" w:hAnsi="宋体" w:eastAsia="宋体"/>
-          <w:sz w:val="24"/>
-        </w:rPr>
-        <w:t>总览页面顶部为一行关键指标卡片，展示任务总量、成功率、平均耗时与红线拦截等；下方以反馈分布饼图、L2/L3 复杂度占比饼图与近 24 小时趋势折线图呈现系统整体态势。</w:t>
-      </w:r>
-    </w:p>
-    <w:p>
-      <w:pPr>
-        <w:jc w:val="center"/>
-      </w:pPr>
-      <w:r>
-        <w:drawing>
-          <wp:inline distT="0" distB="0" distL="114300" distR="114300">
-            <wp:extent cx="5486400" cy="3086100"/>
-            <wp:effectExtent l="0" t="0" r="0" b="0"/>
-            <wp:docPr id="23" name="Picture 23"/>
-            <wp:cNvGraphicFramePr>
-              <a:graphicFrameLocks xmlns:a="http://schemas.openxmlformats.org/drawingml/2006/main" noChangeAspect="1"/>
-            </wp:cNvGraphicFramePr>
-            <a:graphic xmlns:a="http://schemas.openxmlformats.org/drawingml/2006/main">
-              <a:graphicData uri="http://schemas.openxmlformats.org/drawingml/2006/picture">
-                <pic:pic xmlns:pic="http://schemas.openxmlformats.org/drawingml/2006/picture">
-                  <pic:nvPicPr>
-                    <pic:cNvPr id="23" name="Picture 23"/>
                     <pic:cNvPicPr>
                       <a:picLocks noChangeAspect="1"/>
                     </pic:cNvPicPr>
@@ -1780,7 +1668,7 @@
           <w:color w:val="404040"/>
           <w:sz w:val="21"/>
         </w:rPr>
-        <w:t>图26  Web 端总览页面</w:t>
+        <w:t>图25  Web 端登录页面</w:t>
       </w:r>
     </w:p>
     <w:p>
@@ -1788,7 +1676,7 @@
         <w:pStyle w:val="6"/>
       </w:pPr>
       <w:r>
-        <w:t>c、失败归因页面</w:t>
+        <w:t>b、总览页面</w:t>
       </w:r>
     </w:p>
     <w:p>
@@ -1802,7 +1690,7 @@
           <w:rFonts w:ascii="宋体" w:hAnsi="宋体" w:eastAsia="宋体"/>
           <w:sz w:val="24"/>
         </w:rPr>
-        <w:t>失败归因页面采用“图表概览—列表下钻—详情抽屉”的三段式结构。上部为失败类型柱状图与趋势图，中部为失败任务列表；点击条目弹出详情抽屉，展示步骤日志与当时的 LLM 快照。</w:t>
+        <w:t>总览页面顶部为一行关键指标卡片，展示任务总量、成功率、平均耗时与红线拦截等；下方以反馈分布饼图、L2/L3 复杂度占比饼图与近 24 小时趋势折线图呈现系统整体态势。</w:t>
       </w:r>
     </w:p>
     <w:p>
@@ -1814,7 +1702,7 @@
           <wp:inline distT="0" distB="0" distL="114300" distR="114300">
             <wp:extent cx="5486400" cy="3086100"/>
             <wp:effectExtent l="0" t="0" r="0" b="0"/>
-            <wp:docPr id="24" name="Picture 24"/>
+            <wp:docPr id="23" name="Picture 23"/>
             <wp:cNvGraphicFramePr>
               <a:graphicFrameLocks xmlns:a="http://schemas.openxmlformats.org/drawingml/2006/main" noChangeAspect="1"/>
             </wp:cNvGraphicFramePr>
@@ -1822,7 +1710,7 @@
               <a:graphicData uri="http://schemas.openxmlformats.org/drawingml/2006/picture">
                 <pic:pic xmlns:pic="http://schemas.openxmlformats.org/drawingml/2006/picture">
                   <pic:nvPicPr>
-                    <pic:cNvPr id="24" name="Picture 24"/>
+                    <pic:cNvPr id="23" name="Picture 23"/>
                     <pic:cNvPicPr>
                       <a:picLocks noChangeAspect="1"/>
                     </pic:cNvPicPr>
@@ -1861,7 +1749,29 @@
           <w:color w:val="404040"/>
           <w:sz w:val="21"/>
         </w:rPr>
-        <w:t>图27  Web 端失败归因页面</w:t>
+        <w:t>图26  Web 端总览页面</w:t>
+      </w:r>
+    </w:p>
+    <w:p>
+      <w:pPr>
+        <w:pStyle w:val="6"/>
+      </w:pPr>
+      <w:r>
+        <w:t>c、失败归因页面</w:t>
+      </w:r>
+    </w:p>
+    <w:p>
+      <w:pPr>
+        <w:pStyle w:val="11"/>
+        <w:spacing w:after="80"/>
+        <w:ind w:firstLine="480"/>
+      </w:pPr>
+      <w:r>
+        <w:rPr>
+          <w:rFonts w:ascii="宋体" w:hAnsi="宋体" w:eastAsia="宋体"/>
+          <w:sz w:val="24"/>
+        </w:rPr>
+        <w:t>失败归因页面采用“图表概览—列表下钻—详情抽屉”的三段式结构。上部为失败类型柱状图与趋势图，中部为失败任务列表；点击条目弹出详情抽屉，展示步骤日志与当时的 LLM 快照。</w:t>
       </w:r>
     </w:p>
     <w:p>
@@ -1873,7 +1783,7 @@
           <wp:inline distT="0" distB="0" distL="114300" distR="114300">
             <wp:extent cx="5486400" cy="3086100"/>
             <wp:effectExtent l="0" t="0" r="0" b="0"/>
-            <wp:docPr id="25" name="Picture 25"/>
+            <wp:docPr id="24" name="Picture 24"/>
             <wp:cNvGraphicFramePr>
               <a:graphicFrameLocks xmlns:a="http://schemas.openxmlformats.org/drawingml/2006/main" noChangeAspect="1"/>
             </wp:cNvGraphicFramePr>
@@ -1881,7 +1791,7 @@
               <a:graphicData uri="http://schemas.openxmlformats.org/drawingml/2006/picture">
                 <pic:pic xmlns:pic="http://schemas.openxmlformats.org/drawingml/2006/picture">
                   <pic:nvPicPr>
-                    <pic:cNvPr id="25" name="Picture 25"/>
+                    <pic:cNvPr id="24" name="Picture 24"/>
                     <pic:cNvPicPr>
                       <a:picLocks noChangeAspect="1"/>
                     </pic:cNvPicPr>
@@ -1920,29 +1830,7 @@
           <w:color w:val="404040"/>
           <w:sz w:val="21"/>
         </w:rPr>
-        <w:t>图28  失败归因详情抽屉（含 LLM 快照）</w:t>
-      </w:r>
-    </w:p>
-    <w:p>
-      <w:pPr>
-        <w:pStyle w:val="6"/>
-      </w:pPr>
-      <w:r>
-        <w:t>d、数据流监控页面</w:t>
-      </w:r>
-    </w:p>
-    <w:p>
-      <w:pPr>
-        <w:pStyle w:val="11"/>
-        <w:spacing w:after="80"/>
-        <w:ind w:firstLine="480"/>
-      </w:pPr>
-      <w:r>
-        <w:rPr>
-          <w:rFonts w:ascii="宋体" w:hAnsi="宋体" w:eastAsia="宋体"/>
-          <w:sz w:val="24"/>
-        </w:rPr>
-        <w:t>数据流页面以桑基图展示各链路的调用流向，以双轴折线展示 QPS 与成功率，以饼图展示版本分布，帮助掌握端到端的数据流转情况。</w:t>
+        <w:t>图27  Web 端失败归因页面</w:t>
       </w:r>
     </w:p>
     <w:p>
@@ -1954,7 +1842,7 @@
           <wp:inline distT="0" distB="0" distL="114300" distR="114300">
             <wp:extent cx="5486400" cy="3086100"/>
             <wp:effectExtent l="0" t="0" r="0" b="0"/>
-            <wp:docPr id="26" name="Picture 26"/>
+            <wp:docPr id="25" name="Picture 25"/>
             <wp:cNvGraphicFramePr>
               <a:graphicFrameLocks xmlns:a="http://schemas.openxmlformats.org/drawingml/2006/main" noChangeAspect="1"/>
             </wp:cNvGraphicFramePr>
@@ -1962,7 +1850,7 @@
               <a:graphicData uri="http://schemas.openxmlformats.org/drawingml/2006/picture">
                 <pic:pic xmlns:pic="http://schemas.openxmlformats.org/drawingml/2006/picture">
                   <pic:nvPicPr>
-                    <pic:cNvPr id="26" name="Picture 26"/>
+                    <pic:cNvPr id="25" name="Picture 25"/>
                     <pic:cNvPicPr>
                       <a:picLocks noChangeAspect="1"/>
                     </pic:cNvPicPr>
@@ -2001,7 +1889,7 @@
           <w:color w:val="404040"/>
           <w:sz w:val="21"/>
         </w:rPr>
-        <w:t>图29  Web 端数据流监控页面</w:t>
+        <w:t>图28  失败归因详情抽屉（含 LLM 快照）</w:t>
       </w:r>
     </w:p>
     <w:p>
@@ -2009,7 +1897,7 @@
         <w:pStyle w:val="6"/>
       </w:pPr>
       <w:r>
-        <w:t>e、系统配置页面</w:t>
+        <w:t>d、数据流监控页面</w:t>
       </w:r>
     </w:p>
     <w:p>
@@ -2023,7 +1911,7 @@
           <w:rFonts w:ascii="宋体" w:hAnsi="宋体" w:eastAsia="宋体"/>
           <w:sz w:val="24"/>
         </w:rPr>
-        <w:t>系统配置页面以分区表单组织 LLM、路由、审计等各类参数，支持数值与 JSON 编辑，保存后热部署生效并记录部署日志。</w:t>
+        <w:t>数据流页面以桑基图展示各链路的调用流向，以双轴折线展示 QPS 与成功率，以饼图展示版本分布，帮助掌握端到端的数据流转情况。</w:t>
       </w:r>
     </w:p>
     <w:p>
@@ -2035,7 +1923,7 @@
           <wp:inline distT="0" distB="0" distL="114300" distR="114300">
             <wp:extent cx="5486400" cy="3086100"/>
             <wp:effectExtent l="0" t="0" r="0" b="0"/>
-            <wp:docPr id="27" name="Picture 27"/>
+            <wp:docPr id="26" name="Picture 26"/>
             <wp:cNvGraphicFramePr>
               <a:graphicFrameLocks xmlns:a="http://schemas.openxmlformats.org/drawingml/2006/main" noChangeAspect="1"/>
             </wp:cNvGraphicFramePr>
@@ -2043,7 +1931,7 @@
               <a:graphicData uri="http://schemas.openxmlformats.org/drawingml/2006/picture">
                 <pic:pic xmlns:pic="http://schemas.openxmlformats.org/drawingml/2006/picture">
                   <pic:nvPicPr>
-                    <pic:cNvPr id="27" name="Picture 27"/>
+                    <pic:cNvPr id="26" name="Picture 26"/>
                     <pic:cNvPicPr>
                       <a:picLocks noChangeAspect="1"/>
                     </pic:cNvPicPr>
@@ -2082,7 +1970,29 @@
           <w:color w:val="404040"/>
           <w:sz w:val="21"/>
         </w:rPr>
-        <w:t>图30  Web 端系统配置页面（参数表单）</w:t>
+        <w:t>图29  Web 端数据流监控页面</w:t>
+      </w:r>
+    </w:p>
+    <w:p>
+      <w:pPr>
+        <w:pStyle w:val="6"/>
+      </w:pPr>
+      <w:r>
+        <w:t>e、系统配置页面</w:t>
+      </w:r>
+    </w:p>
+    <w:p>
+      <w:pPr>
+        <w:pStyle w:val="11"/>
+        <w:spacing w:after="80"/>
+        <w:ind w:firstLine="480"/>
+      </w:pPr>
+      <w:r>
+        <w:rPr>
+          <w:rFonts w:ascii="宋体" w:hAnsi="宋体" w:eastAsia="宋体"/>
+          <w:sz w:val="24"/>
+        </w:rPr>
+        <w:t>系统配置页面以分区表单组织 LLM、路由、审计等各类参数，支持数值与 JSON 编辑，保存后热部署生效并记录部署日志。</w:t>
       </w:r>
     </w:p>
     <w:p>
@@ -2094,7 +2004,7 @@
           <wp:inline distT="0" distB="0" distL="114300" distR="114300">
             <wp:extent cx="5486400" cy="3086100"/>
             <wp:effectExtent l="0" t="0" r="0" b="0"/>
-            <wp:docPr id="28" name="Picture 28"/>
+            <wp:docPr id="27" name="Picture 27"/>
             <wp:cNvGraphicFramePr>
               <a:graphicFrameLocks xmlns:a="http://schemas.openxmlformats.org/drawingml/2006/main" noChangeAspect="1"/>
             </wp:cNvGraphicFramePr>
@@ -2102,7 +2012,7 @@
               <a:graphicData uri="http://schemas.openxmlformats.org/drawingml/2006/picture">
                 <pic:pic xmlns:pic="http://schemas.openxmlformats.org/drawingml/2006/picture">
                   <pic:nvPicPr>
-                    <pic:cNvPr id="28" name="Picture 28"/>
+                    <pic:cNvPr id="27" name="Picture 27"/>
                     <pic:cNvPicPr>
                       <a:picLocks noChangeAspect="1"/>
                     </pic:cNvPicPr>
@@ -2141,29 +2051,7 @@
           <w:color w:val="404040"/>
           <w:sz w:val="21"/>
         </w:rPr>
-        <w:t>图31  Web 端系统配置页面（部署日志）</w:t>
-      </w:r>
-    </w:p>
-    <w:p>
-      <w:pPr>
-        <w:pStyle w:val="6"/>
-      </w:pPr>
-      <w:r>
-        <w:t>f、用户管理页面</w:t>
-      </w:r>
-    </w:p>
-    <w:p>
-      <w:pPr>
-        <w:pStyle w:val="11"/>
-        <w:spacing w:after="80"/>
-        <w:ind w:firstLine="480"/>
-      </w:pPr>
-      <w:r>
-        <w:rPr>
-          <w:rFonts w:ascii="宋体" w:hAnsi="宋体" w:eastAsia="宋体"/>
-          <w:sz w:val="24"/>
-        </w:rPr>
-        <w:t>用户管理页面列出全部用户及其角色、任务数、最后登录与注册时间，支持按用户名搜索；每行可查看统计、重置密码或删除用户，删除时对历史数据做脱敏保留。</w:t>
+        <w:t>图30  Web 端系统配置页面（参数表单）</w:t>
       </w:r>
     </w:p>
     <w:p>
@@ -2175,7 +2063,7 @@
           <wp:inline distT="0" distB="0" distL="114300" distR="114300">
             <wp:extent cx="5486400" cy="3086100"/>
             <wp:effectExtent l="0" t="0" r="0" b="0"/>
-            <wp:docPr id="29" name="Picture 29"/>
+            <wp:docPr id="28" name="Picture 28"/>
             <wp:cNvGraphicFramePr>
               <a:graphicFrameLocks xmlns:a="http://schemas.openxmlformats.org/drawingml/2006/main" noChangeAspect="1"/>
             </wp:cNvGraphicFramePr>
@@ -2183,7 +2071,7 @@
               <a:graphicData uri="http://schemas.openxmlformats.org/drawingml/2006/picture">
                 <pic:pic xmlns:pic="http://schemas.openxmlformats.org/drawingml/2006/picture">
                   <pic:nvPicPr>
-                    <pic:cNvPr id="29" name="Picture 29"/>
+                    <pic:cNvPr id="28" name="Picture 28"/>
                     <pic:cNvPicPr>
                       <a:picLocks noChangeAspect="1"/>
                     </pic:cNvPicPr>
@@ -2222,7 +2110,7 @@
           <w:color w:val="404040"/>
           <w:sz w:val="21"/>
         </w:rPr>
-        <w:t>图32  Web 端用户管理页面</w:t>
+        <w:t>图31  Web 端系统配置页面（部署日志）</w:t>
       </w:r>
     </w:p>
     <w:p>
@@ -2230,7 +2118,7 @@
         <w:pStyle w:val="6"/>
       </w:pPr>
       <w:r>
-        <w:t>g、健康监控页面</w:t>
+        <w:t>f、用户管理页面</w:t>
       </w:r>
     </w:p>
     <w:p>
@@ -2244,7 +2132,7 @@
           <w:rFonts w:ascii="宋体" w:hAnsi="宋体" w:eastAsia="宋体"/>
           <w:sz w:val="24"/>
         </w:rPr>
-        <w:t>健康监控页面以状态灯呈现各组件在线情况，列出资源占用与告警信息，并支持一键导出 CSV，便于运维人员快速排查异常。</w:t>
+        <w:t>用户管理页面列出全部用户及其角色、任务数、最后登录与注册时间，支持按用户名搜索；每行可查看统计、重置密码或删除用户，删除时对历史数据做脱敏保留。</w:t>
       </w:r>
     </w:p>
     <w:p>
@@ -2256,7 +2144,7 @@
           <wp:inline distT="0" distB="0" distL="114300" distR="114300">
             <wp:extent cx="5486400" cy="3086100"/>
             <wp:effectExtent l="0" t="0" r="0" b="0"/>
-            <wp:docPr id="30" name="Picture 30"/>
+            <wp:docPr id="29" name="Picture 29"/>
             <wp:cNvGraphicFramePr>
               <a:graphicFrameLocks xmlns:a="http://schemas.openxmlformats.org/drawingml/2006/main" noChangeAspect="1"/>
             </wp:cNvGraphicFramePr>
@@ -2264,7 +2152,7 @@
               <a:graphicData uri="http://schemas.openxmlformats.org/drawingml/2006/picture">
                 <pic:pic xmlns:pic="http://schemas.openxmlformats.org/drawingml/2006/picture">
                   <pic:nvPicPr>
-                    <pic:cNvPr id="30" name="Picture 30"/>
+                    <pic:cNvPr id="29" name="Picture 29"/>
                     <pic:cNvPicPr>
                       <a:picLocks noChangeAspect="1"/>
                     </pic:cNvPicPr>
@@ -2295,47 +2183,49 @@
       <w:pPr>
         <w:spacing w:before="40" w:after="120"/>
         <w:jc w:val="center"/>
+      </w:pPr>
+      <w:r>
         <w:rPr>
           <w:rFonts w:ascii="宋体" w:hAnsi="宋体" w:eastAsia="宋体"/>
           <w:b/>
           <w:color w:val="404040"/>
           <w:sz w:val="21"/>
         </w:rPr>
-      </w:pPr>
-      <w:r>
-        <w:rPr>
-          <w:rFonts w:ascii="宋体" w:hAnsi="宋体" w:eastAsia="宋体"/>
-          <w:b/>
-          <w:color w:val="404040"/>
-          <w:sz w:val="21"/>
-        </w:rPr>
-        <w:t>图33  Web 端健康监控页面</w:t>
-      </w:r>
-    </w:p>
-    <w:p>
-      <w:pPr>
-        <w:spacing w:before="40" w:after="120"/>
-        <w:jc w:val="center"/>
-      </w:pPr>
-    </w:p>
-    <w:p>
-      <w:pPr>
-        <w:spacing w:before="40" w:after="120"/>
-        <w:jc w:val="center"/>
-      </w:pPr>
-      <w:r>
-        <w:rPr>
-          <w:rFonts w:hint="eastAsia"/>
-          <w:lang w:val="en-US" w:eastAsia="zh-CN"/>
-        </w:rPr>
-        <w:t>未使用</w:t>
-      </w:r>
+        <w:t>图32  Web 端用户管理页面</w:t>
+      </w:r>
+    </w:p>
+    <w:p>
+      <w:pPr>
+        <w:pStyle w:val="6"/>
+      </w:pPr>
+      <w:r>
+        <w:t>g、健康监控页面</w:t>
+      </w:r>
+    </w:p>
+    <w:p>
+      <w:pPr>
+        <w:pStyle w:val="11"/>
+        <w:spacing w:after="80"/>
+        <w:ind w:firstLine="480"/>
+      </w:pPr>
+      <w:r>
+        <w:rPr>
+          <w:rFonts w:ascii="宋体" w:hAnsi="宋体" w:eastAsia="宋体"/>
+          <w:sz w:val="24"/>
+        </w:rPr>
+        <w:t>健康监控页面以状态灯呈现各组件在线情况，列出资源占用与告警信息，并支持一键导出 CSV，便于运维人员快速排查异常。</w:t>
+      </w:r>
+    </w:p>
+    <w:p>
+      <w:pPr>
+        <w:jc w:val="center"/>
+      </w:pPr>
       <w:r>
         <w:drawing>
           <wp:inline distT="0" distB="0" distL="114300" distR="114300">
-            <wp:extent cx="5394960" cy="3331845"/>
-            <wp:effectExtent l="0" t="0" r="2540" b="8255"/>
-            <wp:docPr id="13" name="Picture 13"/>
+            <wp:extent cx="5486400" cy="3086100"/>
+            <wp:effectExtent l="0" t="0" r="0" b="0"/>
+            <wp:docPr id="30" name="Picture 30"/>
             <wp:cNvGraphicFramePr>
               <a:graphicFrameLocks xmlns:a="http://schemas.openxmlformats.org/drawingml/2006/main" noChangeAspect="1"/>
             </wp:cNvGraphicFramePr>
@@ -2343,7 +2233,7 @@
               <a:graphicData uri="http://schemas.openxmlformats.org/drawingml/2006/picture">
                 <pic:pic xmlns:pic="http://schemas.openxmlformats.org/drawingml/2006/picture">
                   <pic:nvPicPr>
-                    <pic:cNvPr id="13" name="Picture 13"/>
+                    <pic:cNvPr id="30" name="Picture 30"/>
                     <pic:cNvPicPr>
                       <a:picLocks noChangeAspect="1"/>
                     </pic:cNvPicPr>
@@ -2357,7 +2247,7 @@
                   <pic:spPr>
                     <a:xfrm>
                       <a:off x="0" y="0"/>
-                      <a:ext cx="5394960" cy="3332350"/>
+                      <a:ext cx="5486400" cy="3086100"/>
                     </a:xfrm>
                     <a:prstGeom prst="rect">
                       <a:avLst/>
@@ -2369,15 +2259,28 @@
           </wp:inline>
         </w:drawing>
       </w:r>
-      <w:bookmarkStart w:id="0" w:name="_GoBack"/>
-      <w:bookmarkEnd w:id="0"/>
+    </w:p>
+    <w:p>
+      <w:pPr>
+        <w:spacing w:before="40" w:after="120"/>
+        <w:jc w:val="center"/>
+      </w:pPr>
+      <w:r>
+        <w:rPr>
+          <w:rFonts w:ascii="宋体" w:hAnsi="宋体" w:eastAsia="宋体"/>
+          <w:b/>
+          <w:color w:val="404040"/>
+          <w:sz w:val="21"/>
+        </w:rPr>
+        <w:t>图33  Web 端健康监控页面</w:t>
+      </w:r>
     </w:p>
     <w:sectPr>
       <w:headerReference r:id="rId3" w:type="default"/>
       <w:footerReference r:id="rId4" w:type="default"/>
       <w:type w:val="continuous"/>
       <w:pgSz w:w="11906" w:h="16838"/>
-      <w:pgMar w:top="1440" w:right="1106" w:bottom="1440" w:left="1800" w:header="851" w:footer="992" w:gutter="0"/>
+      <w:pgMar w:top="1701" w:right="1531" w:bottom="1701" w:left="1531" w:header="851" w:footer="992" w:gutter="0"/>
       <w:cols w:space="720" w:num="1"/>
       <w:titlePg/>
       <w:docGrid w:type="lines" w:linePitch="312" w:charSpace="0"/>
@@ -2621,12 +2524,12 @@
     <w:lsdException w:uiPriority="39" w:semiHidden="0" w:name="toc 6"/>
     <w:lsdException w:unhideWhenUsed="0" w:uiPriority="39" w:semiHidden="0" w:name="toc 7"/>
     <w:lsdException w:unhideWhenUsed="0" w:uiPriority="39" w:semiHidden="0" w:name="toc 8"/>
-    <w:lsdException w:unhideWhenUsed="0" w:uiPriority="39" w:semiHidden="0" w:name="toc 9"/>
-    <w:lsdException w:unhideWhenUsed="0" w:uiPriority="0" w:semiHidden="0" w:name="Normal Indent"/>
+    <w:lsdException w:qFormat="1" w:unhideWhenUsed="0" w:uiPriority="39" w:semiHidden="0" w:name="toc 9"/>
+    <w:lsdException w:qFormat="1" w:unhideWhenUsed="0" w:uiPriority="0" w:semiHidden="0" w:name="Normal Indent"/>
     <w:lsdException w:uiPriority="99" w:name="footnote text"/>
     <w:lsdException w:uiPriority="99" w:name="annotation text"/>
     <w:lsdException w:unhideWhenUsed="0" w:uiPriority="99" w:semiHidden="0" w:name="header"/>
-    <w:lsdException w:unhideWhenUsed="0" w:uiPriority="99" w:semiHidden="0" w:name="footer"/>
+    <w:lsdException w:qFormat="1" w:unhideWhenUsed="0" w:uiPriority="99" w:semiHidden="0" w:name="footer"/>
     <w:lsdException w:uiPriority="99" w:name="index heading"/>
     <w:lsdException w:qFormat="1" w:unhideWhenUsed="0" w:uiPriority="0" w:semiHidden="0" w:name="caption"/>
     <w:lsdException w:uiPriority="99" w:name="table of figures"/>
@@ -2635,7 +2538,7 @@
     <w:lsdException w:uiPriority="99" w:name="footnote reference"/>
     <w:lsdException w:uiPriority="99" w:name="annotation reference"/>
     <w:lsdException w:uiPriority="99" w:name="line number"/>
-    <w:lsdException w:unhideWhenUsed="0" w:uiPriority="99" w:semiHidden="0" w:name="page number"/>
+    <w:lsdException w:qFormat="1" w:unhideWhenUsed="0" w:uiPriority="99" w:semiHidden="0" w:name="page number"/>
     <w:lsdException w:uiPriority="99" w:name="endnote reference"/>
     <w:lsdException w:uiPriority="99" w:name="endnote text"/>
     <w:lsdException w:unhideWhenUsed="0" w:uiPriority="99" w:semiHidden="0" w:name="table of authorities"/>
@@ -2680,13 +2583,13 @@
     <w:lsdException w:uiPriority="99" w:name="Body Text Indent 3"/>
     <w:lsdException w:uiPriority="99" w:name="Block Text"/>
     <w:lsdException w:unhideWhenUsed="0" w:uiPriority="99" w:semiHidden="0" w:name="Hyperlink"/>
-    <w:lsdException w:unhideWhenUsed="0" w:uiPriority="99" w:semiHidden="0" w:name="FollowedHyperlink"/>
+    <w:lsdException w:qFormat="1" w:unhideWhenUsed="0" w:uiPriority="99" w:semiHidden="0" w:name="FollowedHyperlink"/>
     <w:lsdException w:qFormat="1" w:unhideWhenUsed="0" w:uiPriority="22" w:semiHidden="0" w:name="Strong"/>
     <w:lsdException w:qFormat="1" w:unhideWhenUsed="0" w:uiPriority="20" w:semiHidden="0" w:name="Emphasis"/>
     <w:lsdException w:unhideWhenUsed="0" w:uiPriority="0" w:semiHidden="0" w:name="Document Map"/>
     <w:lsdException w:uiPriority="99" w:name="Plain Text"/>
     <w:lsdException w:uiPriority="99" w:name="E-mail Signature"/>
-    <w:lsdException w:unhideWhenUsed="0" w:uiPriority="0" w:semiHidden="0" w:name="Normal (Web)"/>
+    <w:lsdException w:qFormat="1" w:unhideWhenUsed="0" w:uiPriority="0" w:semiHidden="0" w:name="Normal (Web)"/>
     <w:lsdException w:uiPriority="99" w:name="HTML Acronym"/>
     <w:lsdException w:uiPriority="99" w:name="HTML Address"/>
     <w:lsdException w:uiPriority="99" w:name="HTML Cite"/>
@@ -2742,7 +2645,7 @@
     <w:lsdException w:uiPriority="99" w:name="Table Web 2"/>
     <w:lsdException w:uiPriority="99" w:name="Table Web 3"/>
     <w:lsdException w:unhideWhenUsed="0" w:uiPriority="99" w:semiHidden="0" w:name="Balloon Text"/>
-    <w:lsdException w:unhideWhenUsed="0" w:uiPriority="59" w:semiHidden="0" w:name="Table Grid"/>
+    <w:lsdException w:qFormat="1" w:unhideWhenUsed="0" w:uiPriority="59" w:semiHidden="0" w:name="Table Grid"/>
     <w:lsdException w:uiPriority="99" w:name="Table Theme"/>
     <w:lsdException w:qFormat="1" w:unhideWhenUsed="0" w:uiPriority="1" w:semiHidden="0" w:name="No Spacing"/>
     <w:lsdException w:unhideWhenUsed="0" w:uiPriority="60" w:semiHidden="0" w:name="Light Shading"/>
@@ -3059,6 +2962,7 @@
   <w:style w:type="paragraph" w:styleId="11">
     <w:name w:val="Normal Indent"/>
     <w:basedOn w:val="1"/>
+    <w:qFormat/>
     <w:uiPriority w:val="0"/>
     <w:pPr>
       <w:spacing w:line="360" w:lineRule="auto"/>
@@ -3196,6 +3100,7 @@
     <w:name w:val="footer"/>
     <w:basedOn w:val="1"/>
     <w:link w:val="42"/>
+    <w:qFormat/>
     <w:uiPriority w:val="99"/>
     <w:pPr>
       <w:tabs>
@@ -3297,6 +3202,7 @@
     <w:name w:val="toc 9"/>
     <w:basedOn w:val="1"/>
     <w:next w:val="1"/>
+    <w:qFormat/>
     <w:uiPriority w:val="39"/>
     <w:pPr>
       <w:ind w:left="3360" w:leftChars="1600"/>
@@ -3309,6 +3215,7 @@
   <w:style w:type="paragraph" w:styleId="31">
     <w:name w:val="Normal (Web)"/>
     <w:basedOn w:val="1"/>
+    <w:qFormat/>
     <w:uiPriority w:val="0"/>
     <w:pPr>
       <w:widowControl/>
@@ -3343,6 +3250,7 @@
   <w:style w:type="table" w:styleId="34">
     <w:name w:val="Table Grid"/>
     <w:basedOn w:val="33"/>
+    <w:qFormat/>
     <w:uiPriority w:val="59"/>
     <w:pPr>
       <w:widowControl w:val="0"/>
@@ -3370,11 +3278,13 @@
   <w:style w:type="character" w:styleId="37">
     <w:name w:val="page number"/>
     <w:basedOn w:val="35"/>
+    <w:qFormat/>
     <w:uiPriority w:val="99"/>
   </w:style>
   <w:style w:type="character" w:styleId="38">
     <w:name w:val="FollowedHyperlink"/>
     <w:basedOn w:val="35"/>
+    <w:qFormat/>
     <w:uiPriority w:val="99"/>
     <w:rPr>
       <w:color w:val="800080"/>
@@ -3405,6 +3315,7 @@
     <w:name w:val="标题 4 字符"/>
     <w:basedOn w:val="35"/>
     <w:link w:val="5"/>
+    <w:qFormat/>
     <w:uiPriority w:val="0"/>
     <w:rPr>
       <w:rFonts w:ascii="Arial" w:hAnsi="Arial" w:eastAsia="黑体"/>
@@ -3418,6 +3329,7 @@
     <w:name w:val="页脚 字符"/>
     <w:basedOn w:val="35"/>
     <w:link w:val="23"/>
+    <w:qFormat/>
     <w:uiPriority w:val="99"/>
     <w:rPr>
       <w:kern w:val="2"/>
@@ -3519,6 +3431,7 @@
     <w:name w:val="批注框文本 字符"/>
     <w:basedOn w:val="35"/>
     <w:link w:val="22"/>
+    <w:qFormat/>
     <w:uiPriority w:val="99"/>
     <w:rPr>
       <w:kern w:val="2"/>
@@ -3534,6 +3447,7 @@
   <w:style w:type="character" w:customStyle="1" w:styleId="51">
     <w:name w:val="Unnamed41"/>
     <w:basedOn w:val="35"/>
+    <w:qFormat/>
     <w:uiPriority w:val="99"/>
     <w:rPr>
       <w:rFonts w:cs="Times New Roman"/>
@@ -3545,6 +3459,7 @@
   <w:style w:type="character" w:customStyle="1" w:styleId="52">
     <w:name w:val="标题 5 字符"/>
     <w:link w:val="6"/>
+    <w:qFormat/>
     <w:uiPriority w:val="0"/>
     <w:rPr>
       <w:rFonts w:ascii="Times New Roman" w:hAnsi="Times New Roman" w:eastAsia="宋体" w:cs="Times New Roman"/>
@@ -3564,6 +3479,7 @@
     <w:name w:val="标题 1 字符"/>
     <w:basedOn w:val="35"/>
     <w:link w:val="2"/>
+    <w:qFormat/>
     <w:uiPriority w:val="0"/>
     <w:rPr>
       <w:b/>
@@ -3576,6 +3492,7 @@
     <w:name w:val="正文文本缩进 字符"/>
     <w:basedOn w:val="35"/>
     <w:link w:val="16"/>
+    <w:qFormat/>
     <w:uiPriority w:val="0"/>
     <w:rPr>
       <w:rFonts w:ascii="宋体" w:hAnsi="宋体"/>
@@ -3599,6 +3516,7 @@
   <w:style w:type="paragraph" w:customStyle="1" w:styleId="56">
     <w:name w:val="HD正文1"/>
     <w:basedOn w:val="1"/>
+    <w:qFormat/>
     <w:uiPriority w:val="0"/>
     <w:pPr>
       <w:spacing w:line="440" w:lineRule="atLeast"/>
@@ -3613,6 +3531,7 @@
     <w:name w:val="页眉 字符"/>
     <w:basedOn w:val="35"/>
     <w:link w:val="24"/>
+    <w:qFormat/>
     <w:uiPriority w:val="99"/>
     <w:rPr>
       <w:kern w:val="2"/>
@@ -3624,6 +3543,7 @@
     <w:name w:val="正文文本缩进 2 字符"/>
     <w:basedOn w:val="35"/>
     <w:link w:val="21"/>
+    <w:qFormat/>
     <w:uiPriority w:val="0"/>
     <w:rPr>
       <w:kern w:val="2"/>
@@ -3634,6 +3554,7 @@
     <w:name w:val="文档结构图 字符"/>
     <w:basedOn w:val="35"/>
     <w:link w:val="13"/>
+    <w:qFormat/>
     <w:uiPriority w:val="0"/>
     <w:rPr>
       <w:kern w:val="2"/>
@@ -3657,6 +3578,7 @@
     <w:name w:val="副标题 字符"/>
     <w:basedOn w:val="35"/>
     <w:link w:val="27"/>
+    <w:qFormat/>
     <w:uiPriority w:val="0"/>
     <w:rPr>
       <w:rFonts w:ascii="Cambria" w:hAnsi="Cambria"/>
@@ -3670,6 +3592,7 @@
     <w:name w:val="标题 字符"/>
     <w:basedOn w:val="35"/>
     <w:link w:val="32"/>
+    <w:qFormat/>
     <w:uiPriority w:val="0"/>
     <w:rPr>
       <w:rFonts w:ascii="Cambria" w:hAnsi="Cambria"/>
@@ -3682,12 +3605,14 @@
   <w:style w:type="character" w:customStyle="1" w:styleId="63">
     <w:name w:val="St1"/>
     <w:basedOn w:val="35"/>
+    <w:qFormat/>
     <w:uiPriority w:val="0"/>
   </w:style>
   <w:style w:type="character" w:customStyle="1" w:styleId="64">
     <w:name w:val="标题 6 字符"/>
     <w:basedOn w:val="35"/>
     <w:link w:val="7"/>
+    <w:qFormat/>
     <w:uiPriority w:val="0"/>
     <w:rPr>
       <w:rFonts w:ascii="Cambria" w:hAnsi="Cambria"/>
@@ -3726,6 +3651,7 @@
     <w:name w:val="引用 字符"/>
     <w:basedOn w:val="35"/>
     <w:link w:val="66"/>
+    <w:qFormat/>
     <w:uiPriority w:val="29"/>
     <w:rPr>
       <w:i/>
@@ -3739,6 +3665,7 @@
     <w:name w:val="日期 字符"/>
     <w:basedOn w:val="35"/>
     <w:link w:val="20"/>
+    <w:qFormat/>
     <w:uiPriority w:val="0"/>
     <w:rPr>
       <w:kern w:val="2"/>
@@ -3761,6 +3688,7 @@
   <w:style w:type="paragraph" w:customStyle="1" w:styleId="70">
     <w:name w:val="Char Char1 Char"/>
     <w:basedOn w:val="1"/>
+    <w:qFormat/>
     <w:uiPriority w:val="0"/>
     <w:pPr>
       <w:widowControl/>
@@ -3776,11 +3704,13 @@
   <w:style w:type="character" w:customStyle="1" w:styleId="71">
     <w:name w:val="original Paragraph Font"/>
     <w:unhideWhenUsed/>
+    <w:qFormat/>
     <w:uiPriority w:val="1"/>
   </w:style>
   <w:style w:type="character" w:customStyle="1" w:styleId="72">
     <w:name w:val="Title Char"/>
     <w:basedOn w:val="71"/>
+    <w:qFormat/>
     <w:uiPriority w:val="10"/>
     <w:rPr>
       <w:rFonts w:asciiTheme="majorHAnsi" w:hAnsiTheme="majorHAnsi" w:eastAsiaTheme="majorEastAsia" w:cstheme="majorBidi"/>

</xml_diff>